<commit_message>
Resume: expand OrdinaryKids into a fuller creative-technology story
Grow the OrdinaryKids entry from one line to a context line + three bullets:
pioneering Flash / creative-technology brand work, marquee projects (Nike,
Adidas, skate, MoMA, Tracy Chapman coloring book, Aesop Rock "None Shall
Pass"), and the small team that anchored the SF design scene. Applied to
both the .docx and the clean PDF.

Co-Authored-By: Claude Opus 4.8 <noreply@anthropic.com>
</commit_message>
<xml_diff>
--- a/cv/jason-herring-resume.docx
+++ b/cv/jason-herring-resume.docx
@@ -640,25 +640,79 @@
           <w:sz w:val="19"/>
           <w:szCs w:val="19"/>
         </w:rPr>
-        <w:t xml:space="preserve">San Francisco, CA</w:t>
-      </w:r>
-    </w:p>
-    <w:p>
-      <w:pPr>
-        <w:pStyle w:val="ListParagraph"/>
-        <w:numPr>
-          <w:ilvl w:val="0"/>
-          <w:numId w:val="2"/>
-        </w:numPr>
-        <w:spacing w:after="40"/>
-      </w:pPr>
-      <w:r>
-        <w:rPr>
-          <w:color w:val="1A1A1A"/>
-          <w:sz w:val="20"/>
-          <w:szCs w:val="20"/>
-        </w:rPr>
-        <w:t xml:space="preserve">Ran an award-winning studio for MoMA, Nike, Adidas, Stüssy, HUF, Tracy Chapman, and Aesop Rock; work recognized by Communication Arts and FWA.</w:t>
+        <w:t xml:space="preserve">San Francisco, CA · Founded and ran an award-winning creative studio for 13 years — a small team pioneering the creative use of technology for brand expression, and a hub of the SF interactive design scene.</w:t>
+      </w:r>
+    </w:p>
+    <w:p>
+      <w:pPr>
+        <w:pStyle w:val="ListParagraph"/>
+        <w:numPr>
+          <w:ilvl w:val="0"/>
+          <w:numId w:val="2"/>
+        </w:numPr>
+        <w:spacing w:after="40"/>
+      </w:pPr>
+      <w:r>
+        <w:rPr>
+          <w:color w:val="1A1A1A"/>
+          <w:sz w:val="20"/>
+          <w:szCs w:val="20"/>
+        </w:rPr>
+        <w:t xml:space="preserve">Pioneered early Flash and creative-technology work — interactive brand expression that set a bar across sport, skate, fashion, music, and architecture.</w:t>
+      </w:r>
+    </w:p>
+    <w:p>
+      <w:pPr>
+        <w:pStyle w:val="ListParagraph"/>
+        <w:numPr>
+          <w:ilvl w:val="0"/>
+          <w:numId w:val="2"/>
+        </w:numPr>
+        <w:spacing w:after="40"/>
+      </w:pPr>
+      <w:r>
+        <w:rPr>
+          <w:color w:val="1A1A1A"/>
+          <w:sz w:val="20"/>
+          <w:szCs w:val="20"/>
+        </w:rPr>
+        <w:t xml:space="preserve">Delivered dozens of projects for </w:t>
+      </w:r>
+      <w:r>
+        <w:rPr>
+          <w:b/>
+          <w:bCs/>
+          <w:color w:val="1A1A1A"/>
+          <w:sz w:val="20"/>
+          <w:szCs w:val="20"/>
+        </w:rPr>
+        <w:t xml:space="preserve">Nike and Adidas</w:t>
+      </w:r>
+      <w:r>
+        <w:rPr>
+          <w:color w:val="1A1A1A"/>
+          <w:sz w:val="20"/>
+          <w:szCs w:val="20"/>
+        </w:rPr>
+        <w:t xml:space="preserve"> (including skateboarding), MoMA, Stüssy, HUF, Tracy Chapman / Elektra, and Aesop Rock — from an animated coloring-book experience for Tracy Chapman to the “None Shall Pass” music video.</w:t>
+      </w:r>
+    </w:p>
+    <w:p>
+      <w:pPr>
+        <w:pStyle w:val="ListParagraph"/>
+        <w:numPr>
+          <w:ilvl w:val="0"/>
+          <w:numId w:val="2"/>
+        </w:numPr>
+        <w:spacing w:after="40"/>
+      </w:pPr>
+      <w:r>
+        <w:rPr>
+          <w:color w:val="1A1A1A"/>
+          <w:sz w:val="20"/>
+          <w:szCs w:val="20"/>
+        </w:rPr>
+        <w:t xml:space="preserve">Ran a small, high-output team that became a hub of the San Francisco design scene and launched a generation of Bay Area design careers.</w:t>
       </w:r>
     </w:p>
     <w:p>

</xml_diff>

<commit_message>
Resume: concrete OrdinaryKids flagship projects + specific awards
Name real flagship work (Nike Skateboarding/Running/Sportswear, Adidas
Skateboarding, Brita) and specific recognition (How Magazine Best of Show,
Communication Arts Interactive Annual cover). Update Awards to call out the
CA cover and Print Magazine. Nike Free/FuelBand stay under DualForces to
avoid double-counting. Applied to both .docx and PDF.

Co-Authored-By: Claude Opus 4.8 <noreply@anthropic.com>
</commit_message>
<xml_diff>
--- a/cv/jason-herring-resume.docx
+++ b/cv/jason-herring-resume.docx
@@ -658,61 +658,79 @@
           <w:sz w:val="20"/>
           <w:szCs w:val="20"/>
         </w:rPr>
-        <w:t xml:space="preserve">Pioneered early Flash and creative-technology work — interactive brand expression that set a bar across sport, skate, fashion, music, and architecture.</w:t>
-      </w:r>
-    </w:p>
-    <w:p>
-      <w:pPr>
-        <w:pStyle w:val="ListParagraph"/>
-        <w:numPr>
-          <w:ilvl w:val="0"/>
-          <w:numId w:val="2"/>
-        </w:numPr>
-        <w:spacing w:after="40"/>
-      </w:pPr>
-      <w:r>
-        <w:rPr>
-          <w:color w:val="1A1A1A"/>
-          <w:sz w:val="20"/>
-          <w:szCs w:val="20"/>
-        </w:rPr>
-        <w:t xml:space="preserve">Delivered dozens of projects for </w:t>
-      </w:r>
-      <w:r>
-        <w:rPr>
-          <w:b/>
-          <w:bCs/>
-          <w:color w:val="1A1A1A"/>
-          <w:sz w:val="20"/>
-          <w:szCs w:val="20"/>
-        </w:rPr>
-        <w:t xml:space="preserve">Nike and Adidas</w:t>
-      </w:r>
-      <w:r>
-        <w:rPr>
-          <w:color w:val="1A1A1A"/>
-          <w:sz w:val="20"/>
-          <w:szCs w:val="20"/>
-        </w:rPr>
-        <w:t xml:space="preserve"> (including skateboarding), MoMA, Stüssy, HUF, Tracy Chapman / Elektra, and Aesop Rock — from an animated coloring-book experience for Tracy Chapman to the “None Shall Pass” music video.</w:t>
-      </w:r>
-    </w:p>
-    <w:p>
-      <w:pPr>
-        <w:pStyle w:val="ListParagraph"/>
-        <w:numPr>
-          <w:ilvl w:val="0"/>
-          <w:numId w:val="2"/>
-        </w:numPr>
-        <w:spacing w:after="40"/>
-      </w:pPr>
-      <w:r>
-        <w:rPr>
-          <w:color w:val="1A1A1A"/>
-          <w:sz w:val="20"/>
-          <w:szCs w:val="20"/>
-        </w:rPr>
-        <w:t xml:space="preserve">Ran a small, high-output team that became a hub of the San Francisco design scene and launched a generation of Bay Area design careers.</w:t>
+        <w:t xml:space="preserve">Pioneered early Flash and creative-technology work that set a bar for interactive brand expression across sport, skate, fashion, music, and architecture.</w:t>
+      </w:r>
+    </w:p>
+    <w:p>
+      <w:pPr>
+        <w:pStyle w:val="ListParagraph"/>
+        <w:numPr>
+          <w:ilvl w:val="0"/>
+          <w:numId w:val="2"/>
+        </w:numPr>
+        <w:spacing w:after="40"/>
+      </w:pPr>
+      <w:r>
+        <w:rPr>
+          <w:color w:val="1A1A1A"/>
+          <w:sz w:val="20"/>
+          <w:szCs w:val="20"/>
+        </w:rPr>
+        <w:t xml:space="preserve">Delivered flagship brand work for </w:t>
+      </w:r>
+      <w:r>
+        <w:rPr>
+          <w:b/>
+          <w:bCs/>
+          <w:color w:val="1A1A1A"/>
+          <w:sz w:val="20"/>
+          <w:szCs w:val="20"/>
+        </w:rPr>
+        <w:t xml:space="preserve">Nike</w:t>
+      </w:r>
+      <w:r>
+        <w:rPr>
+          <w:color w:val="1A1A1A"/>
+          <w:sz w:val="20"/>
+          <w:szCs w:val="20"/>
+        </w:rPr>
+        <w:t xml:space="preserve"> (Skateboarding, Running, Sportswear), </w:t>
+      </w:r>
+      <w:r>
+        <w:rPr>
+          <w:b/>
+          <w:bCs/>
+          <w:color w:val="1A1A1A"/>
+          <w:sz w:val="20"/>
+          <w:szCs w:val="20"/>
+        </w:rPr>
+        <w:t xml:space="preserve">Adidas Skateboarding</w:t>
+      </w:r>
+      <w:r>
+        <w:rPr>
+          <w:color w:val="1A1A1A"/>
+          <w:sz w:val="20"/>
+          <w:szCs w:val="20"/>
+        </w:rPr>
+        <w:t xml:space="preserve">, and Brita, alongside cultural projects for MoMA, Stüssy, HUF, Tracy Chapman, and Aesop Rock — including the “None Shall Pass” music video.</w:t>
+      </w:r>
+    </w:p>
+    <w:p>
+      <w:pPr>
+        <w:pStyle w:val="ListParagraph"/>
+        <w:numPr>
+          <w:ilvl w:val="0"/>
+          <w:numId w:val="2"/>
+        </w:numPr>
+        <w:spacing w:after="40"/>
+      </w:pPr>
+      <w:r>
+        <w:rPr>
+          <w:color w:val="1A1A1A"/>
+          <w:sz w:val="20"/>
+          <w:szCs w:val="20"/>
+        </w:rPr>
+        <w:t xml:space="preserve">Recognized with How Magazine Best of Show and a Communication Arts Interactive Annual cover; ran a small team that anchored the SF design scene and launched a generation of Bay Area careers.</w:t>
       </w:r>
     </w:p>
     <w:p>
@@ -865,7 +883,7 @@
           <w:sz w:val="20"/>
           <w:szCs w:val="20"/>
         </w:rPr>
-        <w:t xml:space="preserve">How Magazine, Best of Show (Interactive Annual)  ·  FWA Site of the Day (multiple)  ·  Communication Arts Interactive Annual  ·  Featured in Taschen’s History of Web Design</w:t>
+        <w:t xml:space="preserve">How Magazine, Best of Show (Interactive Annual)  ·  Cover, Communication Arts Interactive Annual  ·  Print Magazine  ·  FWA Site of the Day (multiple)  ·  Featured in Taschen’s History of Web Design</w:t>
       </w:r>
     </w:p>
     <w:sectPr>

</xml_diff>

<commit_message>
Bring CV edits into the ATS resume; move its build into the repo
The resume generators lived in a temp dir and kept getting wiped, so move
them into the repo alongside the CV pipeline and give the resume its own
hand-editable source.

- content/resume.md — ATS-tuned resume content (tighter wording than the CV)
- scripts/build-resume-docx.mjs / build-resume-pdf.mjs — reuse cv-parse.mjs
- npm run resume (both), resume:docx, resume:pdf

Content now matches the CV edits: Intuit Labs as a platform + the strategy
behind it, Delphi as Labs' first experiment, QuickBooks Labs, the R&D focus,
KQED merged into one promotion track, OrdinaryKids reframed as a
generative-art / creative-technology studio, and broadened skills.
</commit_message>
<xml_diff>
--- a/cv/jason-herring-resume.docx
+++ b/cv/jason-herring-resume.docx
@@ -76,7 +76,7 @@
           <w:sz w:val="20"/>
           <w:szCs w:val="20"/>
         </w:rPr>
-        <w:t xml:space="preserve">Principal-level design technologist who ships — I write the code and direct the creative. 20+ years working at the seam of design and engineering, now leading AI prototyping on Intuit’s Foresight team: conversational and voice interfaces, real-time personality engines, and agentic systems that move from speculative demo to shipped product. Recently shipped Intuit Labs (public beta to 1M+ users) and Delphi (delphi.intuit.com).</w:t>
+        <w:t xml:space="preserve">Principal-level design technologist who ships — I write the code and direct the creative. 20+ years at the seam of design and engineering, now leading AI prototyping on Intuit’s Foresight team: conversational and voice interfaces, real-time personality engines, and agentic systems. Built and shipped Intuit Labs (public beta to 1M+ users) and its first experiment, Delphi (delphi.intuit.com).</w:t>
       </w:r>
     </w:p>
     <w:p>
@@ -108,7 +108,7 @@
           <w:sz w:val="20"/>
           <w:szCs w:val="20"/>
         </w:rPr>
-        <w:t xml:space="preserve">Design Engineering &amp; Creative Technology  ·  Conversational &amp; Voice AI  ·  Generative AI, LLMs, RAG &amp; Prompt Engineering  ·  Agentic / Multi-Agent Systems  ·  Real-Time Voice Pipelines (Vapi, LiveKit, Hume, HeyGen)  ·  Rapid Prototyping &amp; High-Fidelity Provocation  ·  Design Systems &amp; Interaction Design (Figma)  ·  TypeScript  ·  React  ·  Next.js  ·  Node.js  ·  Python  ·  Real-Time Systems &amp; API Design  ·  Executive Demos &amp; Design Leadership</w:t>
+        <w:t xml:space="preserve">Design Engineering &amp; Creative Technology  ·  Conversational &amp; Voice AI  ·  Generative AI, LLMs, RAG &amp; Prompt Engineering  ·  Agentic / Multi-Agent Systems  ·  Real-Time Voice Pipelines (Vapi, LiveKit, Hume, HeyGen)  ·  Product Design, UX &amp; Design Systems (Figma)  ·  Web Design / Art Direction / Visual Design  ·  Motion &amp; Interaction Design  ·  Front-End Engineering (React, Next.js, TypeScript)  ·  Node.js / Python / API Design / Real-Time Systems  ·  Creative Direction &amp; Brand Vision  ·  Creative Strategy &amp; Concept Development  ·  Rapid Prototyping &amp; High-Fidelity Provocation  ·  Executive Demos &amp; Design Leadership</w:t>
       </w:r>
     </w:p>
     <w:p>
@@ -145,7 +145,7 @@
           <w:sz w:val="21"/>
           <w:szCs w:val="21"/>
         </w:rPr>
-        <w:t xml:space="preserve">Intuit — Senior Staff Design Technologist, Foresight (AI)</w:t>
+        <w:t xml:space="preserve">Intuit — Senior Staff Design Technologist — Foresight (AI)</w:t>
       </w:r>
       <w:r>
         <w:rPr>
@@ -168,135 +168,115 @@
           <w:sz w:val="19"/>
           <w:szCs w:val="19"/>
         </w:rPr>
-        <w:t xml:space="preserve">Mountain View, CA · Promoted Staff → Senior Staff; served as Group Manager (Feb–Jun 2026) before returning to a senior IC leadership track to keep building. Key builder on Foresight, a 100+ person AI innovation team reporting into the Chief AI Officer org.</w:t>
-      </w:r>
-    </w:p>
-    <w:p>
-      <w:pPr>
-        <w:pStyle w:val="ListParagraph"/>
-        <w:numPr>
-          <w:ilvl w:val="0"/>
-          <w:numId w:val="2"/>
-        </w:numPr>
-        <w:spacing w:after="40"/>
-      </w:pPr>
-      <w:r>
-        <w:rPr>
-          <w:b/>
-          <w:bCs/>
-          <w:color w:val="1A1A1A"/>
-          <w:sz w:val="20"/>
-          <w:szCs w:val="20"/>
-        </w:rPr>
-        <w:t xml:space="preserve">Shipped Intuit Labs</w:t>
-      </w:r>
-      <w:r>
-        <w:rPr>
-          <w:color w:val="1A1A1A"/>
-          <w:sz w:val="20"/>
-          <w:szCs w:val="20"/>
-        </w:rPr>
-        <w:t xml:space="preserve">, a public beta live to </w:t>
-      </w:r>
-      <w:r>
-        <w:rPr>
-          <w:b/>
-          <w:bCs/>
-          <w:color w:val="1A1A1A"/>
-          <w:sz w:val="20"/>
-          <w:szCs w:val="20"/>
-        </w:rPr>
-        <w:t xml:space="preserve">1M+ international users</w:t>
-      </w:r>
-      <w:r>
-        <w:rPr>
-          <w:color w:val="1A1A1A"/>
-          <w:sz w:val="20"/>
-          <w:szCs w:val="20"/>
-        </w:rPr>
-        <w:t xml:space="preserve"> with rollout to all of QuickBooks underway — the surface that turns AI innovation prototypes into shipping product.</w:t>
-      </w:r>
-    </w:p>
-    <w:p>
-      <w:pPr>
-        <w:pStyle w:val="ListParagraph"/>
-        <w:numPr>
-          <w:ilvl w:val="0"/>
-          <w:numId w:val="2"/>
-        </w:numPr>
-        <w:spacing w:after="40"/>
-      </w:pPr>
-      <w:r>
-        <w:rPr>
-          <w:b/>
-          <w:bCs/>
-          <w:color w:val="1A1A1A"/>
-          <w:sz w:val="20"/>
-          <w:szCs w:val="20"/>
-        </w:rPr>
-        <w:t xml:space="preserve">Launched Delphi</w:t>
-      </w:r>
-      <w:r>
-        <w:rPr>
-          <w:color w:val="1A1A1A"/>
-          <w:sz w:val="20"/>
-          <w:szCs w:val="20"/>
-        </w:rPr>
-        <w:t xml:space="preserve"> (delphi.intuit.com), an AI business advisor that turns QuickBooks data into forward-looking recommendations.</w:t>
-      </w:r>
-    </w:p>
-    <w:p>
-      <w:pPr>
-        <w:pStyle w:val="ListParagraph"/>
-        <w:numPr>
-          <w:ilvl w:val="0"/>
-          <w:numId w:val="2"/>
-        </w:numPr>
-        <w:spacing w:after="40"/>
-      </w:pPr>
-      <w:r>
-        <w:rPr>
-          <w:color w:val="1A1A1A"/>
-          <w:sz w:val="20"/>
-          <w:szCs w:val="20"/>
-        </w:rPr>
-        <w:t xml:space="preserve">Designed and built a real-time AI personality engine from scratch — natural language, emotional intelligence, and embodied avatars — on ultra-low-latency voice pipelines (Vapi, Hume, LiveKit, HeyGen).</w:t>
-      </w:r>
-    </w:p>
-    <w:p>
-      <w:pPr>
-        <w:pStyle w:val="ListParagraph"/>
-        <w:numPr>
-          <w:ilvl w:val="0"/>
-          <w:numId w:val="2"/>
-        </w:numPr>
-        <w:spacing w:after="40"/>
-      </w:pPr>
-      <w:r>
-        <w:rPr>
-          <w:color w:val="1A1A1A"/>
-          <w:sz w:val="20"/>
-          <w:szCs w:val="20"/>
-        </w:rPr>
-        <w:t xml:space="preserve">Delivered flagship demos at executive forums and summits that shifted how leadership invests in AI as a product medium.</w:t>
-      </w:r>
-    </w:p>
-    <w:p>
-      <w:pPr>
-        <w:pStyle w:val="ListParagraph"/>
-        <w:numPr>
-          <w:ilvl w:val="0"/>
-          <w:numId w:val="2"/>
-        </w:numPr>
-        <w:spacing w:after="40"/>
-      </w:pPr>
-      <w:r>
-        <w:rPr>
-          <w:color w:val="1A1A1A"/>
-          <w:sz w:val="20"/>
-          <w:szCs w:val="20"/>
-        </w:rPr>
-        <w:t xml:space="preserve">Built org-wide AI-literacy workshops (Demystifying Python, Shipping Conversations, AI Avatars &amp; Voice), seeding hands-on fluency across teams.</w:t>
+        <w:t xml:space="preserve">Mountain View, CA · Key builder on Foresight, a 100+ person AI innovation team reporting into the Chief AI Officer org. Promoted Staff → Senior Staff; served as Group Manager (Feb–Jun 2026) before returning to a senior IC leadership track to keep building.</w:t>
+      </w:r>
+    </w:p>
+    <w:p>
+      <w:pPr>
+        <w:pStyle w:val="ListParagraph"/>
+        <w:numPr>
+          <w:ilvl w:val="0"/>
+          <w:numId w:val="2"/>
+        </w:numPr>
+        <w:spacing w:after="40"/>
+      </w:pPr>
+      <w:r>
+        <w:rPr>
+          <w:color w:val="1A1A1A"/>
+          <w:sz w:val="20"/>
+          <w:szCs w:val="20"/>
+        </w:rPr>
+        <w:t xml:space="preserve">Shipped Intuit Labs (labs.intuit.com/ai) — the platform that turns AI innovation prototypes into shipping product — live in public beta to 1M+ international users, with rollout to all of QuickBooks underway.</w:t>
+      </w:r>
+    </w:p>
+    <w:p>
+      <w:pPr>
+        <w:pStyle w:val="ListParagraph"/>
+        <w:numPr>
+          <w:ilvl w:val="0"/>
+          <w:numId w:val="2"/>
+        </w:numPr>
+        <w:spacing w:after="40"/>
+      </w:pPr>
+      <w:r>
+        <w:rPr>
+          <w:color w:val="1A1A1A"/>
+          <w:sz w:val="20"/>
+          <w:szCs w:val="20"/>
+        </w:rPr>
+        <w:t xml:space="preserve">Built both the site and the strategy behind Labs, defining how experiments graduate from speculative demo to guest-facing feature.</w:t>
+      </w:r>
+    </w:p>
+    <w:p>
+      <w:pPr>
+        <w:pStyle w:val="ListParagraph"/>
+        <w:numPr>
+          <w:ilvl w:val="0"/>
+          <w:numId w:val="2"/>
+        </w:numPr>
+        <w:spacing w:after="40"/>
+      </w:pPr>
+      <w:r>
+        <w:rPr>
+          <w:color w:val="1A1A1A"/>
+          <w:sz w:val="20"/>
+          <w:szCs w:val="20"/>
+        </w:rPr>
+        <w:t xml:space="preserve">Developed Labs’ first experiment, Delphi (delphi.intuit.com) — financial general intelligence that turns QuickBooks data into forward-looking advisory recommendations.</w:t>
+      </w:r>
+    </w:p>
+    <w:p>
+      <w:pPr>
+        <w:pStyle w:val="ListParagraph"/>
+        <w:numPr>
+          <w:ilvl w:val="0"/>
+          <w:numId w:val="2"/>
+        </w:numPr>
+        <w:spacing w:after="40"/>
+      </w:pPr>
+      <w:r>
+        <w:rPr>
+          <w:color w:val="1A1A1A"/>
+          <w:sz w:val="20"/>
+          <w:szCs w:val="20"/>
+        </w:rPr>
+        <w:t xml:space="preserve">Launched QuickBooks Labs, an internal experimentation surface embedded directly inside QuickBooks proper.</w:t>
+      </w:r>
+    </w:p>
+    <w:p>
+      <w:pPr>
+        <w:pStyle w:val="ListParagraph"/>
+        <w:numPr>
+          <w:ilvl w:val="0"/>
+          <w:numId w:val="2"/>
+        </w:numPr>
+        <w:spacing w:after="40"/>
+      </w:pPr>
+      <w:r>
+        <w:rPr>
+          <w:color w:val="1A1A1A"/>
+          <w:sz w:val="20"/>
+          <w:szCs w:val="20"/>
+        </w:rPr>
+        <w:t xml:space="preserve">Lead R&amp;D on emerging technology as it lands — generative AI, real-time voice, and AI personality/emotion detection (Hume); built a real-time AI personality engine from scratch on ultra-low-latency pipelines (Vapi, Hume, LiveKit, HeyGen).</w:t>
+      </w:r>
+    </w:p>
+    <w:p>
+      <w:pPr>
+        <w:pStyle w:val="ListParagraph"/>
+        <w:numPr>
+          <w:ilvl w:val="0"/>
+          <w:numId w:val="2"/>
+        </w:numPr>
+        <w:spacing w:after="40"/>
+      </w:pPr>
+      <w:r>
+        <w:rPr>
+          <w:color w:val="1A1A1A"/>
+          <w:sz w:val="20"/>
+          <w:szCs w:val="20"/>
+        </w:rPr>
+        <w:t xml:space="preserve">Delivered flagship demos at executive forums and summits, and built org-wide AI-literacy workshops (Demystifying Python, Shipping Conversations, AI Avatars &amp; Voice).</w:t>
       </w:r>
     </w:p>
     <w:p>
@@ -355,61 +335,25 @@
           <w:sz w:val="20"/>
           <w:szCs w:val="20"/>
         </w:rPr>
-        <w:t xml:space="preserve">Grew annual revenue </w:t>
-      </w:r>
-      <w:r>
-        <w:rPr>
-          <w:b/>
-          <w:bCs/>
-          <w:color w:val="1A1A1A"/>
-          <w:sz w:val="20"/>
-          <w:szCs w:val="20"/>
-        </w:rPr>
-        <w:t xml:space="preserve">85%+</w:t>
-      </w:r>
-      <w:r>
-        <w:rPr>
-          <w:color w:val="1A1A1A"/>
-          <w:sz w:val="20"/>
-          <w:szCs w:val="20"/>
-        </w:rPr>
-        <w:t xml:space="preserve"> over four years through new-client acquisition and expanded scopes.</w:t>
-      </w:r>
-    </w:p>
-    <w:p>
-      <w:pPr>
-        <w:pStyle w:val="ListParagraph"/>
-        <w:numPr>
-          <w:ilvl w:val="0"/>
-          <w:numId w:val="2"/>
-        </w:numPr>
-        <w:spacing w:after="40"/>
-      </w:pPr>
-      <w:r>
-        <w:rPr>
-          <w:color w:val="1A1A1A"/>
-          <w:sz w:val="20"/>
-          <w:szCs w:val="20"/>
-        </w:rPr>
-        <w:t xml:space="preserve">Directed a Helix clinical-trials mobile app — notifications, dashboards, and protocol-compliance tools — lifting user-acquisition success </w:t>
-      </w:r>
-      <w:r>
-        <w:rPr>
-          <w:b/>
-          <w:bCs/>
-          <w:color w:val="1A1A1A"/>
-          <w:sz w:val="20"/>
-          <w:szCs w:val="20"/>
-        </w:rPr>
-        <w:t xml:space="preserve">22%</w:t>
-      </w:r>
-      <w:r>
-        <w:rPr>
-          <w:color w:val="1A1A1A"/>
-          <w:sz w:val="20"/>
-          <w:szCs w:val="20"/>
-        </w:rPr>
-        <w:t xml:space="preserve">.</w:t>
+        <w:t xml:space="preserve">Grew annual revenue 85%+ over four years through new-client acquisition and expanded scopes.</w:t>
+      </w:r>
+    </w:p>
+    <w:p>
+      <w:pPr>
+        <w:pStyle w:val="ListParagraph"/>
+        <w:numPr>
+          <w:ilvl w:val="0"/>
+          <w:numId w:val="2"/>
+        </w:numPr>
+        <w:spacing w:after="40"/>
+      </w:pPr>
+      <w:r>
+        <w:rPr>
+          <w:color w:val="1A1A1A"/>
+          <w:sz w:val="20"/>
+          <w:szCs w:val="20"/>
+        </w:rPr>
+        <w:t xml:space="preserve">Directed a Helix clinical-trials mobile app — notifications, dashboards, and protocol-compliance tools — lifting user-acquisition success 22%.</w:t>
       </w:r>
     </w:p>
     <w:p>
@@ -445,7 +389,7 @@
           <w:sz w:val="21"/>
           <w:szCs w:val="21"/>
         </w:rPr>
-        <w:t xml:space="preserve">KQED — Director of Digital Design &amp; Development</w:t>
+        <w:t xml:space="preserve">KQED — Lead UX Designer → Director of Digital Design &amp; Development</w:t>
       </w:r>
       <w:r>
         <w:rPr>
@@ -453,7 +397,7 @@
           <w:sz w:val="18"/>
           <w:szCs w:val="18"/>
         </w:rPr>
-        <w:t xml:space="preserve">	Aug 2018 – Mar 2020</w:t>
+        <w:t xml:space="preserve">	Jan 2015 – Mar 2020</w:t>
       </w:r>
     </w:p>
     <w:p>
@@ -468,43 +412,79 @@
           <w:sz w:val="19"/>
           <w:szCs w:val="19"/>
         </w:rPr>
-        <w:t xml:space="preserve">San Francisco, CA · Owned design and engineering for Northern California’s largest public-media organization.</w:t>
-      </w:r>
-    </w:p>
-    <w:p>
-      <w:pPr>
-        <w:pStyle w:val="ListParagraph"/>
-        <w:numPr>
-          <w:ilvl w:val="0"/>
-          <w:numId w:val="2"/>
-        </w:numPr>
-        <w:spacing w:after="40"/>
-      </w:pPr>
-      <w:r>
-        <w:rPr>
-          <w:color w:val="1A1A1A"/>
-          <w:sz w:val="20"/>
-          <w:szCs w:val="20"/>
-        </w:rPr>
-        <w:t xml:space="preserve">Led the multi-year KQED.org redesign and re-platformed a large WordPress CMS to GCP Kubernetes (canary deploys, instant rollbacks), powering hundreds of thousands of articles and partner feeds (NPR, Apple News, Google News).</w:t>
-      </w:r>
-    </w:p>
-    <w:p>
-      <w:pPr>
-        <w:pStyle w:val="ListParagraph"/>
-        <w:numPr>
-          <w:ilvl w:val="0"/>
-          <w:numId w:val="2"/>
-        </w:numPr>
-        <w:spacing w:after="40"/>
-      </w:pPr>
-      <w:r>
-        <w:rPr>
-          <w:color w:val="1A1A1A"/>
-          <w:sz w:val="20"/>
-          <w:szCs w:val="20"/>
-        </w:rPr>
-        <w:t xml:space="preserve">Shipped automated audio workflows for Alexa, Google Assistant, and NPR One; built real-time 2018 election infrastructure across every Bay Area county.</w:t>
+        <w:t xml:space="preserve">San Francisco, CA · Joined as Lead UX Designer and promoted to Director — from hands-on product design to leading the design and technology that transformed KQED.org for millions of listeners and readers.</w:t>
+      </w:r>
+    </w:p>
+    <w:p>
+      <w:pPr>
+        <w:pStyle w:val="ListParagraph"/>
+        <w:numPr>
+          <w:ilvl w:val="0"/>
+          <w:numId w:val="2"/>
+        </w:numPr>
+        <w:spacing w:after="40"/>
+      </w:pPr>
+      <w:r>
+        <w:rPr>
+          <w:color w:val="1A1A1A"/>
+          <w:sz w:val="20"/>
+          <w:szCs w:val="20"/>
+        </w:rPr>
+        <w:t xml:space="preserve">The Listening Project: led a complete redesign of KQED Radio, News, Arts, Science, and the homepage — persistent audio player, flexible editorial content system, and a real-time “trending” experience.</w:t>
+      </w:r>
+    </w:p>
+    <w:p>
+      <w:pPr>
+        <w:pStyle w:val="ListParagraph"/>
+        <w:numPr>
+          <w:ilvl w:val="0"/>
+          <w:numId w:val="2"/>
+        </w:numPr>
+        <w:spacing w:after="40"/>
+      </w:pPr>
+      <w:r>
+        <w:rPr>
+          <w:color w:val="1A1A1A"/>
+          <w:sz w:val="20"/>
+          <w:szCs w:val="20"/>
+        </w:rPr>
+        <w:t xml:space="preserve">2016 Election Voter Guide: shipped one of public media’s first single-page apps (WordPress → Elasticsearch + React), adopted as a model across NPR member stations; the election dashboard drew 1M+ views on election night.</w:t>
+      </w:r>
+    </w:p>
+    <w:p>
+      <w:pPr>
+        <w:pStyle w:val="ListParagraph"/>
+        <w:numPr>
+          <w:ilvl w:val="0"/>
+          <w:numId w:val="2"/>
+        </w:numPr>
+        <w:spacing w:after="40"/>
+      </w:pPr>
+      <w:r>
+        <w:rPr>
+          <w:color w:val="1A1A1A"/>
+          <w:sz w:val="20"/>
+          <w:szCs w:val="20"/>
+        </w:rPr>
+        <w:t xml:space="preserve">Led the multi-year KQED.org redesign and migrated a large WordPress CMS from AWS to Kubernetes on Google Cloud — canary deploys and instant rollbacks, powering hundreds of thousands of articles and partner feeds (NPR, Apple News, Google News).</w:t>
+      </w:r>
+    </w:p>
+    <w:p>
+      <w:pPr>
+        <w:pStyle w:val="ListParagraph"/>
+        <w:numPr>
+          <w:ilvl w:val="0"/>
+          <w:numId w:val="2"/>
+        </w:numPr>
+        <w:spacing w:after="40"/>
+      </w:pPr>
+      <w:r>
+        <w:rPr>
+          <w:color w:val="1A1A1A"/>
+          <w:sz w:val="20"/>
+          <w:szCs w:val="20"/>
+        </w:rPr>
+        <w:t xml:space="preserve">Designed automated audio workflows for Alexa, Google Assistant, and NPR One; built real-time 2018 election infrastructure across every Bay Area county.</w:t>
       </w:r>
     </w:p>
     <w:p>
@@ -522,7 +502,7 @@
           <w:sz w:val="21"/>
           <w:szCs w:val="21"/>
         </w:rPr>
-        <w:t xml:space="preserve">KQED — Lead UX Designer</w:t>
+        <w:t xml:space="preserve">OrdinaryKids — Founder &amp; Creative Director</w:t>
       </w:r>
       <w:r>
         <w:rPr>
@@ -530,7 +510,7 @@
           <w:sz w:val="18"/>
           <w:szCs w:val="18"/>
         </w:rPr>
-        <w:t xml:space="preserve">	Jan 2015 – Aug 2018</w:t>
+        <w:t xml:space="preserve">	Jan 2001 – Jan 2015</w:t>
       </w:r>
     </w:p>
     <w:p>
@@ -545,192 +525,79 @@
           <w:sz w:val="19"/>
           <w:szCs w:val="19"/>
         </w:rPr>
-        <w:t xml:space="preserve">San Francisco, CA</w:t>
-      </w:r>
-    </w:p>
-    <w:p>
-      <w:pPr>
-        <w:pStyle w:val="ListParagraph"/>
-        <w:numPr>
-          <w:ilvl w:val="0"/>
-          <w:numId w:val="2"/>
-        </w:numPr>
-        <w:spacing w:after="40"/>
-      </w:pPr>
-      <w:r>
-        <w:rPr>
-          <w:color w:val="1A1A1A"/>
-          <w:sz w:val="20"/>
-          <w:szCs w:val="20"/>
-        </w:rPr>
-        <w:t xml:space="preserve">Redesigned KQED Radio, News, Arts, Science, and the homepage (persistent audio player, real-time trending); election dashboard drew </w:t>
-      </w:r>
-      <w:r>
-        <w:rPr>
-          <w:b/>
-          <w:bCs/>
-          <w:color w:val="1A1A1A"/>
-          <w:sz w:val="20"/>
-          <w:szCs w:val="20"/>
-        </w:rPr>
-        <w:t xml:space="preserve">1M+ views</w:t>
-      </w:r>
-      <w:r>
-        <w:rPr>
-          <w:color w:val="1A1A1A"/>
-          <w:sz w:val="20"/>
-          <w:szCs w:val="20"/>
-        </w:rPr>
-        <w:t xml:space="preserve"> on 2016 election night.</w:t>
-      </w:r>
-    </w:p>
-    <w:p>
-      <w:pPr>
-        <w:pStyle w:val="ListParagraph"/>
-        <w:numPr>
-          <w:ilvl w:val="0"/>
-          <w:numId w:val="2"/>
-        </w:numPr>
-        <w:spacing w:after="40"/>
-      </w:pPr>
-      <w:r>
-        <w:rPr>
-          <w:color w:val="1A1A1A"/>
-          <w:sz w:val="20"/>
-          <w:szCs w:val="20"/>
-        </w:rPr>
-        <w:t xml:space="preserve">Shipped one of public media’s first single-page apps — the 2016 Voter Guide (WordPress → Elasticsearch + React) — adopted as a model across NPR member stations.</w:t>
-      </w:r>
-    </w:p>
-    <w:p>
-      <w:pPr>
-        <w:tabs>
-          <w:tab w:val="right" w:pos="10080"/>
-        </w:tabs>
-        <w:spacing w:after="0" w:before="150"/>
-      </w:pPr>
-      <w:r>
-        <w:rPr>
-          <w:b/>
-          <w:bCs/>
-          <w:color w:val="1A1A1A"/>
-          <w:sz w:val="21"/>
-          <w:szCs w:val="21"/>
-        </w:rPr>
-        <w:t xml:space="preserve">OrdinaryKids — Founder &amp; Creative Director</w:t>
-      </w:r>
-      <w:r>
-        <w:rPr>
-          <w:color w:val="555555"/>
-          <w:sz w:val="18"/>
-          <w:szCs w:val="18"/>
-        </w:rPr>
-        <w:t xml:space="preserve">	Jan 2001 – Jan 2015</w:t>
-      </w:r>
-    </w:p>
-    <w:p>
-      <w:pPr>
-        <w:spacing w:after="60" w:before="20"/>
-      </w:pPr>
-      <w:r>
-        <w:rPr>
-          <w:i/>
-          <w:iCs/>
-          <w:color w:val="555555"/>
-          <w:sz w:val="19"/>
-          <w:szCs w:val="19"/>
-        </w:rPr>
-        <w:t xml:space="preserve">San Francisco, CA · Founded and ran an award-winning creative studio for 13 years — a small team pioneering the creative use of technology for brand expression, and a hub of the SF interactive design scene.</w:t>
-      </w:r>
-    </w:p>
-    <w:p>
-      <w:pPr>
-        <w:pStyle w:val="ListParagraph"/>
-        <w:numPr>
-          <w:ilvl w:val="0"/>
-          <w:numId w:val="2"/>
-        </w:numPr>
-        <w:spacing w:after="40"/>
-      </w:pPr>
-      <w:r>
-        <w:rPr>
-          <w:color w:val="1A1A1A"/>
-          <w:sz w:val="20"/>
-          <w:szCs w:val="20"/>
-        </w:rPr>
-        <w:t xml:space="preserve">Pioneered early Flash and creative-technology work that set a bar for interactive brand expression across sport, skate, fashion, music, and architecture.</w:t>
-      </w:r>
-    </w:p>
-    <w:p>
-      <w:pPr>
-        <w:pStyle w:val="ListParagraph"/>
-        <w:numPr>
-          <w:ilvl w:val="0"/>
-          <w:numId w:val="2"/>
-        </w:numPr>
-        <w:spacing w:after="40"/>
-      </w:pPr>
-      <w:r>
-        <w:rPr>
-          <w:color w:val="1A1A1A"/>
-          <w:sz w:val="20"/>
-          <w:szCs w:val="20"/>
-        </w:rPr>
-        <w:t xml:space="preserve">Delivered flagship brand work for </w:t>
-      </w:r>
-      <w:r>
-        <w:rPr>
-          <w:b/>
-          <w:bCs/>
-          <w:color w:val="1A1A1A"/>
-          <w:sz w:val="20"/>
-          <w:szCs w:val="20"/>
-        </w:rPr>
-        <w:t xml:space="preserve">Nike</w:t>
-      </w:r>
-      <w:r>
-        <w:rPr>
-          <w:color w:val="1A1A1A"/>
-          <w:sz w:val="20"/>
-          <w:szCs w:val="20"/>
-        </w:rPr>
-        <w:t xml:space="preserve"> (Skateboarding, Running, Sportswear), </w:t>
-      </w:r>
-      <w:r>
-        <w:rPr>
-          <w:b/>
-          <w:bCs/>
-          <w:color w:val="1A1A1A"/>
-          <w:sz w:val="20"/>
-          <w:szCs w:val="20"/>
-        </w:rPr>
-        <w:t xml:space="preserve">Adidas Skateboarding</w:t>
-      </w:r>
-      <w:r>
-        <w:rPr>
-          <w:color w:val="1A1A1A"/>
-          <w:sz w:val="20"/>
-          <w:szCs w:val="20"/>
-        </w:rPr>
-        <w:t xml:space="preserve">, and Brita, alongside cultural projects for MoMA, Stüssy, HUF, Tracy Chapman, and Aesop Rock — including the “None Shall Pass” music video.</w:t>
-      </w:r>
-    </w:p>
-    <w:p>
-      <w:pPr>
-        <w:pStyle w:val="ListParagraph"/>
-        <w:numPr>
-          <w:ilvl w:val="0"/>
-          <w:numId w:val="2"/>
-        </w:numPr>
-        <w:spacing w:after="40"/>
-      </w:pPr>
-      <w:r>
-        <w:rPr>
-          <w:color w:val="1A1A1A"/>
-          <w:sz w:val="20"/>
-          <w:szCs w:val="20"/>
-        </w:rPr>
-        <w:t xml:space="preserve">Recognized with How Magazine Best of Show and a Communication Arts Interactive Annual cover; ran a small team that anchored the SF design scene and launched a generation of Bay Area careers.</w:t>
+        <w:t xml:space="preserve">San Francisco, CA · Founded and ran a generative-art and creative-technology studio for 13 years — a small team treating code as a creative medium, and a hub of the SF interactive design scene.</w:t>
+      </w:r>
+    </w:p>
+    <w:p>
+      <w:pPr>
+        <w:pStyle w:val="ListParagraph"/>
+        <w:numPr>
+          <w:ilvl w:val="0"/>
+          <w:numId w:val="2"/>
+        </w:numPr>
+        <w:spacing w:after="40"/>
+      </w:pPr>
+      <w:r>
+        <w:rPr>
+          <w:color w:val="1A1A1A"/>
+          <w:sz w:val="20"/>
+          <w:szCs w:val="20"/>
+        </w:rPr>
+        <w:t xml:space="preserve">Pioneered generative and interactive work in ActionScript, Processing, and early creative-coding tools — custom code-driven visual systems, generative type and identity, and audio-reactive experiences years before “creative technology” was a discipline.</w:t>
+      </w:r>
+    </w:p>
+    <w:p>
+      <w:pPr>
+        <w:pStyle w:val="ListParagraph"/>
+        <w:numPr>
+          <w:ilvl w:val="0"/>
+          <w:numId w:val="2"/>
+        </w:numPr>
+        <w:spacing w:after="40"/>
+      </w:pPr>
+      <w:r>
+        <w:rPr>
+          <w:color w:val="1A1A1A"/>
+          <w:sz w:val="20"/>
+          <w:szCs w:val="20"/>
+        </w:rPr>
+        <w:t xml:space="preserve">Delivered flagship brand work for Nike (Skateboarding, Running, Sportswear), Adidas Skateboarding, and Brita, alongside cultural projects for MoMA, Stüssy, HUF, Tracy Chapman, and Aesop Rock — including the “None Shall Pass” music video.</w:t>
+      </w:r>
+    </w:p>
+    <w:p>
+      <w:pPr>
+        <w:pStyle w:val="ListParagraph"/>
+        <w:numPr>
+          <w:ilvl w:val="0"/>
+          <w:numId w:val="2"/>
+        </w:numPr>
+        <w:spacing w:after="40"/>
+      </w:pPr>
+      <w:r>
+        <w:rPr>
+          <w:color w:val="1A1A1A"/>
+          <w:sz w:val="20"/>
+          <w:szCs w:val="20"/>
+        </w:rPr>
+        <w:t xml:space="preserve">Recognized with How Magazine Best of Show, a Communication Arts Interactive Annual cover, and FWA Site of the Day honors; work archived in Taschen’s History of Web Design.</w:t>
+      </w:r>
+    </w:p>
+    <w:p>
+      <w:pPr>
+        <w:pStyle w:val="ListParagraph"/>
+        <w:numPr>
+          <w:ilvl w:val="0"/>
+          <w:numId w:val="2"/>
+        </w:numPr>
+        <w:spacing w:after="40"/>
+      </w:pPr>
+      <w:r>
+        <w:rPr>
+          <w:color w:val="1A1A1A"/>
+          <w:sz w:val="20"/>
+          <w:szCs w:val="20"/>
+        </w:rPr>
+        <w:t xml:space="preserve">Ran a small, tight studio that anchored the SF design scene and launched a generation of Bay Area design and creative-technology careers.</w:t>
       </w:r>
     </w:p>
     <w:p>

</xml_diff>